<commit_message>
Guion en formato pdf con indice y portada.
</commit_message>
<xml_diff>
--- a/P6-Extra/Opcional/P6-Opcional.docx
+++ b/P6-Extra/Opcional/P6-Opcional.docx
@@ -1,7 +1,15 @@
 
 <file path=word/document.xml><?xml version="1.0" encoding="utf-8"?>
-<w:document xmlns:wpc="http://schemas.microsoft.com/office/word/2010/wordprocessingCanvas" xmlns:cx="http://schemas.microsoft.com/office/drawing/2014/chartex" xmlns:cx1="http://schemas.microsoft.com/office/drawing/2015/9/8/chartex" xmlns:mc="http://schemas.openxmlformats.org/markup-compatibility/2006" xmlns:o="urn:schemas-microsoft-com:office:office" xmlns:r="http://schemas.openxmlformats.org/officeDocument/2006/relationships" xmlns:m="http://schemas.openxmlformats.org/officeDocument/2006/math" xmlns:v="urn:schemas-microsoft-com:vml" xmlns:wp14="http://schemas.microsoft.com/office/word/2010/wordprocessingDrawing" xmlns:wp="http://schemas.openxmlformats.org/drawingml/2006/wordprocessingDrawing" xmlns:w10="urn:schemas-microsoft-com:office:word" xmlns:w="http://schemas.openxmlformats.org/wordprocessingml/2006/main" xmlns:w14="http://schemas.microsoft.com/office/word/2010/wordml" xmlns:w15="http://schemas.microsoft.com/office/word/2012/wordml" xmlns:w16se="http://schemas.microsoft.com/office/word/2015/wordml/symex" xmlns:wpg="http://schemas.microsoft.com/office/word/2010/wordprocessingGroup" xmlns:wpi="http://schemas.microsoft.com/office/word/2010/wordprocessingInk" xmlns:wne="http://schemas.microsoft.com/office/word/2006/wordml" xmlns:wps="http://schemas.microsoft.com/office/word/2010/wordprocessingShape" mc:Ignorable="w14 w15 w16se wp14">
+<w:document xmlns:wpc="http://schemas.microsoft.com/office/word/2010/wordprocessingCanvas" xmlns:cx="http://schemas.microsoft.com/office/drawing/2014/chartex" xmlns:mc="http://schemas.openxmlformats.org/markup-compatibility/2006" xmlns:o="urn:schemas-microsoft-com:office:office" xmlns:r="http://schemas.openxmlformats.org/officeDocument/2006/relationships" xmlns:m="http://schemas.openxmlformats.org/officeDocument/2006/math" xmlns:v="urn:schemas-microsoft-com:vml" xmlns:wp14="http://schemas.microsoft.com/office/word/2010/wordprocessingDrawing" xmlns:wp="http://schemas.openxmlformats.org/drawingml/2006/wordprocessingDrawing" xmlns:w10="urn:schemas-microsoft-com:office:word" xmlns:w="http://schemas.openxmlformats.org/wordprocessingml/2006/main" xmlns:w14="http://schemas.microsoft.com/office/word/2010/wordml" xmlns:w15="http://schemas.microsoft.com/office/word/2012/wordml" xmlns:w16se="http://schemas.microsoft.com/office/word/2015/wordml/symex" xmlns:wpg="http://schemas.microsoft.com/office/word/2010/wordprocessingGroup" xmlns:wpi="http://schemas.microsoft.com/office/word/2010/wordprocessingInk" xmlns:wne="http://schemas.microsoft.com/office/word/2006/wordml" xmlns:wps="http://schemas.microsoft.com/office/word/2010/wordprocessingShape" mc:Ignorable="w14 w15 w16se wp14">
   <w:body>
+    <w:p>
+      <w:pPr>
+        <w:pStyle w:val="Textoindependiente"/>
+        <w:rPr>
+          <w:sz w:val="24"/>
+        </w:rPr>
+      </w:pPr>
+    </w:p>
     <w:p>
       <w:pPr>
         <w:pStyle w:val="Textoindependiente"/>
@@ -75,23 +83,7 @@
           <w:b/>
           <w:sz w:val="24"/>
         </w:rPr>
-        <w:t xml:space="preserve">para los valores de n expuestos (5000,10000, 20000, 40000, 80000, …). Si para alguna n tardara más de 60 segundos puede poner </w:t>
-      </w:r>
-      <w:proofErr w:type="spellStart"/>
-      <w:r>
-        <w:rPr>
-          <w:b/>
-          <w:sz w:val="24"/>
-        </w:rPr>
-        <w:t>FdT</w:t>
-      </w:r>
-      <w:proofErr w:type="spellEnd"/>
-      <w:r>
-        <w:rPr>
-          <w:b/>
-          <w:sz w:val="24"/>
-        </w:rPr>
-        <w:t xml:space="preserve"> (“Fuera de Tiempo”), tanto en este apartado como en los apartados posteriores.</w:t>
+        <w:t>para los valores de n expuestos (5000,10000, 20000, 40000, 80000, …). Si para alguna n tardara más de 60 segundos puede poner FdT (“Fuera de Tiempo”), tanto en este apartado como en los apartados posteriores.</w:t>
       </w:r>
     </w:p>
     <w:p>
@@ -997,21 +989,7 @@
         <w:rPr>
           <w:sz w:val="24"/>
         </w:rPr>
-        <w:t xml:space="preserve">Un </w:t>
-      </w:r>
-      <w:proofErr w:type="spellStart"/>
-      <w:r>
-        <w:rPr>
-          <w:sz w:val="24"/>
-        </w:rPr>
-        <w:t>long</w:t>
-      </w:r>
-      <w:proofErr w:type="spellEnd"/>
-      <w:r>
-        <w:rPr>
-          <w:sz w:val="24"/>
-        </w:rPr>
-        <w:t xml:space="preserve"> son 64 bits, lo que da para 18.446.744.073.709.551.616 combinaciones, </w:t>
+        <w:t xml:space="preserve">Un long son 64 bits, lo que da para 18.446.744.073.709.551.616 combinaciones, </w:t>
       </w:r>
       <w:r>
         <w:rPr>
@@ -1023,35 +1001,7 @@
         <w:rPr>
           <w:sz w:val="24"/>
         </w:rPr>
-        <w:t xml:space="preserve">y desde que se empezó a usar, se va por el </w:t>
-      </w:r>
-      <w:proofErr w:type="spellStart"/>
-      <w:r>
-        <w:rPr>
-          <w:sz w:val="24"/>
-        </w:rPr>
-        <w:t>numero</w:t>
-      </w:r>
-      <w:proofErr w:type="spellEnd"/>
-      <w:r>
-        <w:rPr>
-          <w:sz w:val="24"/>
-        </w:rPr>
-        <w:t xml:space="preserve"> 1.770.228.540.138, por lo que el </w:t>
-      </w:r>
-      <w:proofErr w:type="spellStart"/>
-      <w:r>
-        <w:rPr>
-          <w:sz w:val="24"/>
-        </w:rPr>
-        <w:t>numero</w:t>
-      </w:r>
-      <w:proofErr w:type="spellEnd"/>
-      <w:r>
-        <w:rPr>
-          <w:sz w:val="24"/>
-        </w:rPr>
-        <w:t xml:space="preserve"> de años que quedan es el siguiente: </w:t>
+        <w:t xml:space="preserve">y desde que se empezó a usar, se va por el numero 1.770.228.540.138, por lo que el numero de años que quedan es el siguiente: </w:t>
       </w:r>
       <w:r>
         <w:rPr>
@@ -1088,23 +1038,7 @@
           <w:b/>
           <w:sz w:val="24"/>
         </w:rPr>
-        <w:t>Tabla para las ejecuciones usando –</w:t>
-      </w:r>
-      <w:proofErr w:type="spellStart"/>
-      <w:r>
-        <w:rPr>
-          <w:b/>
-          <w:sz w:val="24"/>
-        </w:rPr>
-        <w:t>Xint</w:t>
-      </w:r>
-      <w:proofErr w:type="spellEnd"/>
-      <w:r>
-        <w:rPr>
-          <w:b/>
-          <w:sz w:val="24"/>
-        </w:rPr>
-        <w:t xml:space="preserve"> Vector2</w:t>
+        <w:t>Tabla para las ejecuciones usando –Xint Vector2</w:t>
       </w:r>
     </w:p>
     <w:tbl>
@@ -1412,23 +1346,7 @@
           <w:b/>
           <w:sz w:val="24"/>
         </w:rPr>
-        <w:t>Ejecuciones usando –</w:t>
-      </w:r>
-      <w:proofErr w:type="spellStart"/>
-      <w:r>
-        <w:rPr>
-          <w:b/>
-          <w:sz w:val="24"/>
-        </w:rPr>
-        <w:t>Xint</w:t>
-      </w:r>
-      <w:proofErr w:type="spellEnd"/>
-      <w:r>
-        <w:rPr>
-          <w:b/>
-          <w:sz w:val="24"/>
-        </w:rPr>
-        <w:t xml:space="preserve"> Vector3</w:t>
+        <w:t>Ejecuciones usando –Xint Vector3</w:t>
       </w:r>
     </w:p>
     <w:p>
@@ -1519,23 +1437,7 @@
           <w:b/>
           <w:sz w:val="24"/>
         </w:rPr>
-        <w:t>Gráfica de complejidad usando –</w:t>
-      </w:r>
-      <w:proofErr w:type="spellStart"/>
-      <w:r>
-        <w:rPr>
-          <w:b/>
-          <w:sz w:val="24"/>
-        </w:rPr>
-        <w:t>Xint</w:t>
-      </w:r>
-      <w:proofErr w:type="spellEnd"/>
-      <w:r>
-        <w:rPr>
-          <w:b/>
-          <w:sz w:val="24"/>
-        </w:rPr>
-        <w:t xml:space="preserve"> Vector3</w:t>
+        <w:t>Gráfica de complejidad usando –Xint Vector3</w:t>
       </w:r>
     </w:p>
     <w:p>
@@ -1614,23 +1516,7 @@
           <w:b/>
           <w:sz w:val="24"/>
         </w:rPr>
-        <w:t>Ejecuciones usando –</w:t>
-      </w:r>
-      <w:proofErr w:type="spellStart"/>
-      <w:r>
-        <w:rPr>
-          <w:b/>
-          <w:sz w:val="24"/>
-        </w:rPr>
-        <w:t>Xint</w:t>
-      </w:r>
-      <w:proofErr w:type="spellEnd"/>
-      <w:r>
-        <w:rPr>
-          <w:b/>
-          <w:sz w:val="24"/>
-        </w:rPr>
-        <w:t xml:space="preserve"> Vector4</w:t>
+        <w:t>Ejecuciones usando –Xint Vector4</w:t>
       </w:r>
     </w:p>
     <w:p>
@@ -3779,23 +3665,7 @@
           <w:b/>
           <w:sz w:val="24"/>
         </w:rPr>
-        <w:t xml:space="preserve">ucle5, Bucle6 y Bucle7, que simulen algoritmos iterativos con una complejidad </w:t>
-      </w:r>
-      <w:proofErr w:type="gramStart"/>
-      <w:r>
-        <w:rPr>
-          <w:b/>
-          <w:sz w:val="24"/>
-        </w:rPr>
-        <w:t>O(</w:t>
-      </w:r>
-      <w:proofErr w:type="gramEnd"/>
-      <w:r>
-        <w:rPr>
-          <w:b/>
-          <w:sz w:val="24"/>
-        </w:rPr>
-        <w:t>n</w:t>
+        <w:t>ucle5, Bucle6 y Bucle7, que simulen algoritmos iterativos con una complejidad O(n</w:t>
       </w:r>
       <w:r>
         <w:rPr>
@@ -4063,6 +3933,14 @@
         </w:drawing>
       </w:r>
     </w:p>
+    <w:p>
+      <w:pPr>
+        <w:rPr>
+          <w:sz w:val="28"/>
+          <w:szCs w:val="26"/>
+        </w:rPr>
+      </w:pPr>
+    </w:p>
     <w:tbl>
       <w:tblPr>
         <w:tblStyle w:val="Tablaconcuadrcula"/>
@@ -4094,6 +3972,7 @@
                 <w:sz w:val="24"/>
                 <w:szCs w:val="26"/>
               </w:rPr>
+              <w:lastRenderedPageBreak/>
               <w:t>n</w:t>
             </w:r>
           </w:p>
@@ -4184,7 +4063,6 @@
                 <w:sz w:val="24"/>
                 <w:szCs w:val="26"/>
               </w:rPr>
-              <w:lastRenderedPageBreak/>
               <w:t>100</w:t>
             </w:r>
           </w:p>
@@ -5979,7 +5857,15 @@
                 <w:sz w:val="24"/>
                 <w:szCs w:val="26"/>
               </w:rPr>
-              <w:t>T3/t2</w:t>
+              <w:t>t</w:t>
+            </w:r>
+            <w:r>
+              <w:rPr>
+                <w:b/>
+                <w:sz w:val="24"/>
+                <w:szCs w:val="26"/>
+              </w:rPr>
+              <w:t>3/t2</w:t>
             </w:r>
           </w:p>
         </w:tc>
@@ -6847,7 +6733,6 @@
           <w:b/>
           <w:sz w:val="24"/>
         </w:rPr>
-        <w:lastRenderedPageBreak/>
         <w:t>Razone si los diferentes tiempos y su cociente concuerda con lo esperado.</w:t>
       </w:r>
     </w:p>
@@ -6974,34 +6859,14 @@
                 <w:szCs w:val="26"/>
               </w:rPr>
             </w:pPr>
-            <w:proofErr w:type="spellStart"/>
             <w:r>
               <w:rPr>
                 <w:b/>
                 <w:sz w:val="24"/>
                 <w:szCs w:val="26"/>
               </w:rPr>
-              <w:t>tPython</w:t>
-            </w:r>
-            <w:proofErr w:type="spellEnd"/>
-            <w:r>
-              <w:rPr>
-                <w:b/>
-                <w:sz w:val="24"/>
-                <w:szCs w:val="26"/>
-              </w:rPr>
-              <w:t>/</w:t>
-            </w:r>
-            <w:proofErr w:type="spellStart"/>
-            <w:r>
-              <w:rPr>
-                <w:b/>
-                <w:sz w:val="24"/>
-                <w:szCs w:val="26"/>
-              </w:rPr>
-              <w:t>tJava</w:t>
-            </w:r>
-            <w:proofErr w:type="spellEnd"/>
+              <w:t>tPython/tJava</w:t>
+            </w:r>
           </w:p>
         </w:tc>
       </w:tr>
@@ -11081,49 +10946,7 @@
         <w:rPr>
           <w:sz w:val="24"/>
         </w:rPr>
-        <w:t xml:space="preserve">Este algoritmo obtiene una complejidad </w:t>
-      </w:r>
-      <w:proofErr w:type="spellStart"/>
-      <w:r>
-        <w:rPr>
-          <w:sz w:val="24"/>
-        </w:rPr>
-        <w:t>quasi</w:t>
-      </w:r>
-      <w:proofErr w:type="spellEnd"/>
-      <w:r>
-        <w:rPr>
-          <w:sz w:val="24"/>
-        </w:rPr>
-        <w:t xml:space="preserve">-lineal en los tres casos, cuando esta ordenado, aleatorio o inversamente ordenado, teniendo casi siempre una complejidad de </w:t>
-      </w:r>
-      <w:proofErr w:type="gramStart"/>
-      <w:r>
-        <w:rPr>
-          <w:sz w:val="24"/>
-        </w:rPr>
-        <w:t>O(</w:t>
-      </w:r>
-      <w:proofErr w:type="gramEnd"/>
-      <w:r>
-        <w:rPr>
-          <w:sz w:val="24"/>
-        </w:rPr>
-        <w:t xml:space="preserve">n </w:t>
-      </w:r>
-      <w:proofErr w:type="spellStart"/>
-      <w:r>
-        <w:rPr>
-          <w:sz w:val="24"/>
-        </w:rPr>
-        <w:t>logn</w:t>
-      </w:r>
-      <w:proofErr w:type="spellEnd"/>
-      <w:r>
-        <w:rPr>
-          <w:sz w:val="24"/>
-        </w:rPr>
-        <w:t xml:space="preserve">), </w:t>
+        <w:t xml:space="preserve">Este algoritmo obtiene una complejidad quasi-lineal en los tres casos, cuando esta ordenado, aleatorio o inversamente ordenado, teniendo casi siempre una complejidad de O(n logn), </w:t>
       </w:r>
       <w:r>
         <w:rPr>
@@ -11174,37 +10997,12 @@
         </w:rPr>
         <w:t xml:space="preserve">Los resultados experimentales concuerdan con la complejidad teórica del algoritmo implementado, ya que el tiempo crece aproximadamente por un factor cercano a 2 al duplicar n (comportamiento de la complejidad </w:t>
       </w:r>
-      <w:proofErr w:type="gramStart"/>
-      <w:r>
-        <w:rPr>
-          <w:sz w:val="24"/>
-          <w:szCs w:val="24"/>
-        </w:rPr>
-        <w:t>O(</w:t>
-      </w:r>
-      <w:proofErr w:type="gramEnd"/>
-      <w:r>
-        <w:rPr>
-          <w:sz w:val="24"/>
-          <w:szCs w:val="24"/>
-        </w:rPr>
-        <w:t xml:space="preserve">n </w:t>
-      </w:r>
-      <w:proofErr w:type="spellStart"/>
-      <w:r>
-        <w:rPr>
-          <w:sz w:val="24"/>
-          <w:szCs w:val="24"/>
-        </w:rPr>
-        <w:t>logn</w:t>
-      </w:r>
-      <w:proofErr w:type="spellEnd"/>
-      <w:r>
-        <w:rPr>
-          <w:sz w:val="24"/>
-          <w:szCs w:val="24"/>
-        </w:rPr>
-        <w:t>)), presentando en los tres casos tiempos similares.</w:t>
+      <w:r>
+        <w:rPr>
+          <w:sz w:val="24"/>
+          <w:szCs w:val="24"/>
+        </w:rPr>
+        <w:t>O(n logn)), presentando en los tres casos tiempos similares.</w:t>
       </w:r>
     </w:p>
     <w:p>
@@ -11428,35 +11226,7 @@
         <w:rPr>
           <w:sz w:val="24"/>
         </w:rPr>
-        <w:t xml:space="preserve">Por último, para el algoritmo Rápido, con complejidad </w:t>
-      </w:r>
-      <w:proofErr w:type="gramStart"/>
-      <w:r>
-        <w:rPr>
-          <w:sz w:val="24"/>
-        </w:rPr>
-        <w:t>O(</w:t>
-      </w:r>
-      <w:proofErr w:type="gramEnd"/>
-      <w:r>
-        <w:rPr>
-          <w:sz w:val="24"/>
-        </w:rPr>
-        <w:t xml:space="preserve">n </w:t>
-      </w:r>
-      <w:proofErr w:type="spellStart"/>
-      <w:r>
-        <w:rPr>
-          <w:sz w:val="24"/>
-        </w:rPr>
-        <w:t>logn</w:t>
-      </w:r>
-      <w:proofErr w:type="spellEnd"/>
-      <w:r>
-        <w:rPr>
-          <w:sz w:val="24"/>
-        </w:rPr>
-        <w:t>), y con t</w:t>
+        <w:t>Por último, para el algoritmo Rápido, con complejidad O(n logn), y con t</w:t>
       </w:r>
       <w:r>
         <w:rPr>
@@ -11505,7 +11275,6 @@
         </w:rPr>
         <w:t>⋅</w:t>
       </w:r>
-      <w:proofErr w:type="spellStart"/>
       <w:r>
         <w:rPr>
           <w:sz w:val="24"/>
@@ -11523,28 +11292,7 @@
         <w:rPr>
           <w:sz w:val="24"/>
         </w:rPr>
-        <w:t>logn</w:t>
-      </w:r>
-      <w:proofErr w:type="spellEnd"/>
-      <w:r>
-        <w:rPr>
-          <w:sz w:val="24"/>
-        </w:rPr>
-        <w:t>/​</w:t>
-      </w:r>
-      <w:proofErr w:type="spellStart"/>
-      <w:r>
-        <w:rPr>
-          <w:sz w:val="24"/>
-        </w:rPr>
-        <w:t>logn</w:t>
-      </w:r>
-      <w:proofErr w:type="spellEnd"/>
-      <w:r>
-        <w:rPr>
-          <w:sz w:val="24"/>
-        </w:rPr>
-        <w:t>​</w:t>
+        <w:t>logn/​logn​</w:t>
       </w:r>
       <w:r>
         <w:rPr>
@@ -13438,35 +13186,7 @@
         <w:rPr>
           <w:sz w:val="24"/>
         </w:rPr>
-        <w:t xml:space="preserve">El algoritmo rápido comenzará a tardar menos tiempo que el de inserción para valores de n suficientemente grandes. En la tabla la relación de tiempos disminuye progresivamente, lo que concuerda con que rápido tiene complejidad </w:t>
-      </w:r>
-      <w:proofErr w:type="gramStart"/>
-      <w:r>
-        <w:rPr>
-          <w:sz w:val="24"/>
-        </w:rPr>
-        <w:t>O(</w:t>
-      </w:r>
-      <w:proofErr w:type="gramEnd"/>
-      <w:r>
-        <w:rPr>
-          <w:sz w:val="24"/>
-        </w:rPr>
-        <w:t xml:space="preserve">n </w:t>
-      </w:r>
-      <w:proofErr w:type="spellStart"/>
-      <w:r>
-        <w:rPr>
-          <w:sz w:val="24"/>
-        </w:rPr>
-        <w:t>logn</w:t>
-      </w:r>
-      <w:proofErr w:type="spellEnd"/>
-      <w:r>
-        <w:rPr>
-          <w:sz w:val="24"/>
-        </w:rPr>
-        <w:t>) frente a O(n</w:t>
+        <w:t>El algoritmo rápido comenzará a tardar menos tiempo que el de inserción para valores de n suficientemente grandes. En la tabla la relación de tiempos disminuye progresivamente, lo que concuerda con que rápido tiene complejidad O(n logn) frente a O(n</w:t>
       </w:r>
       <w:r>
         <w:rPr>
@@ -13507,12 +13227,14 @@
         <w:pStyle w:val="Textoindependiente"/>
         <w:rPr>
           <w:b/>
-          <w:sz w:val="24"/>
-        </w:rPr>
-      </w:pPr>
-      <w:r>
-        <w:rPr>
-          <w:b/>
+          <w:color w:val="FF0000"/>
+          <w:sz w:val="24"/>
+        </w:rPr>
+      </w:pPr>
+      <w:r>
+        <w:rPr>
+          <w:b/>
+          <w:color w:val="FF0000"/>
           <w:sz w:val="24"/>
         </w:rPr>
         <w:t>A partir del análisis de los resultados obtenidos en el apartado anterior, puede diseñar e implementar un algoritmo que combine el método rápido con el método inserción, teniendo como objetivo bajar los tiempos obtenidos por el rápido y reflejados en la TABLA4.</w:t>
@@ -13523,12 +13245,14 @@
         <w:pStyle w:val="Textoindependiente"/>
         <w:rPr>
           <w:b/>
-          <w:sz w:val="24"/>
-        </w:rPr>
-      </w:pPr>
-      <w:r>
-        <w:rPr>
-          <w:b/>
+          <w:color w:val="FF0000"/>
+          <w:sz w:val="24"/>
+        </w:rPr>
+      </w:pPr>
+      <w:r>
+        <w:rPr>
+          <w:b/>
+          <w:color w:val="FF0000"/>
           <w:sz w:val="24"/>
         </w:rPr>
         <w:t>Calcular los tiempos del algoritmo diseñado y compararlos con los del rápido, para acabar concluyendo en qué grado se consiguió el objetivo antes enunciado.</w:t>
@@ -13597,21 +13321,7 @@
         <w:rPr>
           <w:sz w:val="24"/>
         </w:rPr>
-        <w:t xml:space="preserve">la complejidad del método es </w:t>
-      </w:r>
-      <w:proofErr w:type="gramStart"/>
-      <w:r>
-        <w:rPr>
-          <w:sz w:val="24"/>
-        </w:rPr>
-        <w:t>O(</w:t>
-      </w:r>
-      <w:proofErr w:type="gramEnd"/>
-      <w:r>
-        <w:rPr>
-          <w:sz w:val="24"/>
-        </w:rPr>
-        <w:t xml:space="preserve">1), teniendo a=1, b=1 y k=0, por lo que </w:t>
+        <w:t xml:space="preserve">la complejidad del método es O(1), teniendo a=1, b=1 y k=0, por lo que </w:t>
       </w:r>
       <w:r>
         <w:rPr>
@@ -13716,122 +13426,134 @@
         <w:rPr>
           <w:sz w:val="24"/>
         </w:rPr>
-        <w:t>, a=2 (ya que hay 2 llamadas recursivas) y b=1, por lo que la complejidad temporal es O(</w:t>
-      </w:r>
-      <w:proofErr w:type="spellStart"/>
-      <w:r>
-        <w:rPr>
-          <w:sz w:val="24"/>
-        </w:rPr>
-        <w:t>a</w:t>
+        <w:t>, a=2 (ya que hay 2 llamadas recursivas) y b=1, por lo que la complejidad temporal es O(a</w:t>
       </w:r>
       <w:r>
         <w:rPr>
           <w:sz w:val="24"/>
           <w:vertAlign w:val="superscript"/>
         </w:rPr>
+        <w:t>n/b</w:t>
+      </w:r>
+      <w:r>
+        <w:rPr>
+          <w:sz w:val="24"/>
+        </w:rPr>
+        <w:t>) que es O(2</w:t>
+      </w:r>
+      <w:r>
+        <w:rPr>
+          <w:sz w:val="24"/>
+          <w:vertAlign w:val="superscript"/>
+        </w:rPr>
         <w:t>n</w:t>
       </w:r>
-      <w:proofErr w:type="spellEnd"/>
+      <w:r>
+        <w:rPr>
+          <w:sz w:val="24"/>
+        </w:rPr>
+        <w:t>).</w:t>
+      </w:r>
+    </w:p>
+    <w:p>
+      <w:pPr>
+        <w:pStyle w:val="Textoindependiente"/>
+        <w:rPr>
+          <w:b/>
+          <w:sz w:val="24"/>
+        </w:rPr>
+      </w:pPr>
+      <w:r>
+        <w:rPr>
+          <w:b/>
+          <w:sz w:val="24"/>
+        </w:rPr>
+        <w:t>Contestar: ¿para qué valor de n dejan de dar tiempo (abortan) las clases Sustracción1 y Sustracción2? ¿por qué sucede eso?</w:t>
+      </w:r>
+    </w:p>
+    <w:p>
+      <w:pPr>
+        <w:pStyle w:val="Textoindependiente"/>
+        <w:rPr>
+          <w:sz w:val="24"/>
+        </w:rPr>
+      </w:pPr>
+      <w:r>
+        <w:rPr>
+          <w:sz w:val="24"/>
+        </w:rPr>
+        <w:t>Para un n = 8000, ya que se produce un desbordamiento de la pila debido a la cantidad de llamadas recursivas.</w:t>
+      </w:r>
+    </w:p>
+    <w:p>
+      <w:pPr>
+        <w:pStyle w:val="Textoindependiente"/>
+        <w:rPr>
+          <w:b/>
+          <w:sz w:val="24"/>
+        </w:rPr>
+      </w:pPr>
+      <w:r>
+        <w:rPr>
+          <w:b/>
+          <w:sz w:val="24"/>
+        </w:rPr>
+        <w:t xml:space="preserve">Calcular: ¿cuántos años tardaría en finalizar la ejecución Sustracción3 para n=80? Razonar la respuesta. </w:t>
+      </w:r>
+    </w:p>
+    <w:p>
+      <w:pPr>
+        <w:pStyle w:val="Textoindependiente"/>
+        <w:rPr>
+          <w:sz w:val="24"/>
+        </w:rPr>
+      </w:pPr>
+      <w:r>
+        <w:rPr>
+          <w:sz w:val="24"/>
+        </w:rPr>
+        <w:t>De ejecutarlo 1 vez se saca que para n = 32, t=180086 ms ≈ 180 s, por lo que T(80)=T(32)</w:t>
+      </w:r>
+      <w:r>
+        <w:rPr>
+          <w:rFonts w:ascii="Cambria Math" w:hAnsi="Cambria Math" w:cs="Cambria Math"/>
+          <w:sz w:val="24"/>
+        </w:rPr>
+        <w:t>⋅</w:t>
+      </w:r>
+      <w:r>
+        <w:rPr>
+          <w:sz w:val="24"/>
+        </w:rPr>
+        <w:t>2</w:t>
+      </w:r>
       <w:r>
         <w:rPr>
           <w:sz w:val="24"/>
           <w:vertAlign w:val="superscript"/>
         </w:rPr>
-        <w:t>/b</w:t>
-      </w:r>
-      <w:r>
-        <w:rPr>
-          <w:sz w:val="24"/>
-        </w:rPr>
-        <w:t>) que es O(2</w:t>
-      </w:r>
-      <w:r>
-        <w:rPr>
+        <w:t>80</w:t>
+      </w:r>
+      <w:r>
+        <w:rPr>
+          <w:rFonts w:ascii="Calibri" w:hAnsi="Calibri" w:cs="Calibri"/>
           <w:sz w:val="24"/>
           <w:vertAlign w:val="superscript"/>
         </w:rPr>
-        <w:t>n</w:t>
-      </w:r>
-      <w:r>
-        <w:rPr>
-          <w:sz w:val="24"/>
-        </w:rPr>
-        <w:t>).</w:t>
-      </w:r>
-    </w:p>
-    <w:p>
-      <w:pPr>
-        <w:pStyle w:val="Textoindependiente"/>
-        <w:rPr>
-          <w:b/>
-          <w:sz w:val="24"/>
-        </w:rPr>
-      </w:pPr>
-      <w:r>
-        <w:rPr>
-          <w:b/>
-          <w:sz w:val="24"/>
-        </w:rPr>
-        <w:t>Contestar: ¿para qué valor de n dejan de dar tiempo (abortan) las clases Sustracción1 y Sustracción2? ¿por qué sucede eso?</w:t>
-      </w:r>
-    </w:p>
-    <w:p>
-      <w:pPr>
-        <w:pStyle w:val="Textoindependiente"/>
-        <w:rPr>
-          <w:sz w:val="24"/>
-        </w:rPr>
-      </w:pPr>
-      <w:r>
-        <w:rPr>
-          <w:sz w:val="24"/>
-        </w:rPr>
-        <w:t>Para un n = 8000, ya que se produce un desbordamiento de la pila debido a la cantidad de llamadas recursivas.</w:t>
-      </w:r>
-    </w:p>
-    <w:p>
-      <w:pPr>
-        <w:pStyle w:val="Textoindependiente"/>
-        <w:rPr>
-          <w:b/>
-          <w:sz w:val="24"/>
-        </w:rPr>
-      </w:pPr>
-      <w:r>
-        <w:rPr>
-          <w:b/>
-          <w:sz w:val="24"/>
-        </w:rPr>
-        <w:t xml:space="preserve">Calcular: ¿cuántos años tardaría en finalizar la ejecución Sustracción3 para n=80? Razonar la respuesta. </w:t>
-      </w:r>
-    </w:p>
-    <w:p>
-      <w:pPr>
-        <w:pStyle w:val="Textoindependiente"/>
-        <w:rPr>
-          <w:sz w:val="24"/>
-        </w:rPr>
-      </w:pPr>
-      <w:r>
-        <w:rPr>
-          <w:sz w:val="24"/>
-        </w:rPr>
-        <w:t>De ejecutarlo 1 vez se saca que para n = 32, t=180086 ms ≈ 180 s, por lo que T(</w:t>
-      </w:r>
-      <w:proofErr w:type="gramStart"/>
-      <w:r>
-        <w:rPr>
-          <w:sz w:val="24"/>
-        </w:rPr>
-        <w:t>80)=</w:t>
-      </w:r>
-      <w:proofErr w:type="gramEnd"/>
-      <w:r>
-        <w:rPr>
-          <w:sz w:val="24"/>
-        </w:rPr>
-        <w:t>T(32)</w:t>
+        <w:t>−</w:t>
+      </w:r>
+      <w:r>
+        <w:rPr>
+          <w:sz w:val="24"/>
+          <w:vertAlign w:val="superscript"/>
+        </w:rPr>
+        <w:t xml:space="preserve">32 </w:t>
+      </w:r>
+      <w:r>
+        <w:rPr>
+          <w:sz w:val="24"/>
+        </w:rPr>
+        <w:t>= 180</w:t>
       </w:r>
       <w:r>
         <w:rPr>
@@ -13851,28 +13573,78 @@
           <w:sz w:val="24"/>
           <w:vertAlign w:val="superscript"/>
         </w:rPr>
-        <w:t>80</w:t>
-      </w:r>
-      <w:r>
-        <w:rPr>
-          <w:rFonts w:ascii="Calibri" w:hAnsi="Calibri" w:cs="Calibri"/>
+        <w:t xml:space="preserve">48 </w:t>
+      </w:r>
+      <w:r>
+        <w:rPr>
+          <w:sz w:val="24"/>
+        </w:rPr>
+        <w:t>= 180</w:t>
+      </w:r>
+      <w:r>
+        <w:rPr>
+          <w:rFonts w:ascii="Cambria Math" w:hAnsi="Cambria Math" w:cs="Cambria Math"/>
+          <w:sz w:val="24"/>
+        </w:rPr>
+        <w:t>⋅</w:t>
+      </w:r>
+      <w:r>
+        <w:rPr>
+          <w:sz w:val="24"/>
+        </w:rPr>
+        <w:t>2,56</w:t>
+      </w:r>
+      <w:r>
+        <w:rPr>
+          <w:rFonts w:ascii="Cambria Math" w:hAnsi="Cambria Math" w:cs="Cambria Math"/>
+          <w:sz w:val="24"/>
+        </w:rPr>
+        <w:t>⋅</w:t>
+      </w:r>
+      <w:r>
+        <w:rPr>
+          <w:sz w:val="24"/>
+        </w:rPr>
+        <w:t>10</w:t>
+      </w:r>
+      <w:r>
+        <w:rPr>
           <w:sz w:val="24"/>
           <w:vertAlign w:val="superscript"/>
         </w:rPr>
-        <w:t>−</w:t>
+        <w:t xml:space="preserve">14 </w:t>
+      </w:r>
+      <w:r>
+        <w:rPr>
+          <w:sz w:val="24"/>
+        </w:rPr>
+        <w:t>= 4.608</w:t>
+      </w:r>
+      <w:r>
+        <w:rPr>
+          <w:rFonts w:ascii="Cambria Math" w:hAnsi="Cambria Math" w:cs="Cambria Math"/>
+          <w:sz w:val="24"/>
+        </w:rPr>
+        <w:t>⋅</w:t>
+      </w:r>
+      <w:r>
+        <w:rPr>
+          <w:sz w:val="24"/>
+        </w:rPr>
+        <w:t>10</w:t>
       </w:r>
       <w:r>
         <w:rPr>
           <w:sz w:val="24"/>
           <w:vertAlign w:val="superscript"/>
         </w:rPr>
-        <w:t xml:space="preserve">32 </w:t>
-      </w:r>
-      <w:r>
-        <w:rPr>
-          <w:sz w:val="24"/>
-        </w:rPr>
-        <w:t>= 180</w:t>
+        <w:t>16</w:t>
+      </w:r>
+      <w:r>
+        <w:rPr>
+          <w:sz w:val="24"/>
+        </w:rPr>
+        <w:t xml:space="preserve"> segundos = 1,46</w:t>
       </w:r>
       <w:r>
         <w:rPr>
@@ -13885,185 +13657,60 @@
         <w:rPr>
           <w:sz w:val="24"/>
         </w:rPr>
-        <w:t>2</w:t>
+        <w:t>10</w:t>
       </w:r>
       <w:r>
         <w:rPr>
           <w:sz w:val="24"/>
           <w:vertAlign w:val="superscript"/>
         </w:rPr>
-        <w:t xml:space="preserve">48 </w:t>
-      </w:r>
-      <w:r>
-        <w:rPr>
-          <w:sz w:val="24"/>
-        </w:rPr>
-        <w:t>= 180</w:t>
-      </w:r>
-      <w:r>
-        <w:rPr>
-          <w:rFonts w:ascii="Cambria Math" w:hAnsi="Cambria Math" w:cs="Cambria Math"/>
-          <w:sz w:val="24"/>
-        </w:rPr>
-        <w:t>⋅</w:t>
-      </w:r>
-      <w:r>
-        <w:rPr>
-          <w:sz w:val="24"/>
-        </w:rPr>
-        <w:t>2,56</w:t>
-      </w:r>
-      <w:r>
-        <w:rPr>
-          <w:rFonts w:ascii="Cambria Math" w:hAnsi="Cambria Math" w:cs="Cambria Math"/>
-          <w:sz w:val="24"/>
-        </w:rPr>
-        <w:t>⋅</w:t>
-      </w:r>
-      <w:r>
-        <w:rPr>
-          <w:sz w:val="24"/>
-        </w:rPr>
-        <w:t>10</w:t>
-      </w:r>
-      <w:r>
-        <w:rPr>
+        <w:t>9</w:t>
+      </w:r>
+      <w:r>
+        <w:rPr>
+          <w:sz w:val="24"/>
+        </w:rPr>
+        <w:t xml:space="preserve"> años</w:t>
+      </w:r>
+    </w:p>
+    <w:p>
+      <w:pPr>
+        <w:pStyle w:val="Textoindependiente"/>
+        <w:rPr>
+          <w:b/>
+          <w:sz w:val="24"/>
+          <w:lang w:val="en-GB"/>
+        </w:rPr>
+      </w:pPr>
+      <w:r>
+        <w:rPr>
+          <w:b/>
+          <w:sz w:val="24"/>
+        </w:rPr>
+        <w:t>Implementar una clase Sustracción4.java con una complejidad O(n</w:t>
+      </w:r>
+      <w:r>
+        <w:rPr>
+          <w:b/>
           <w:sz w:val="24"/>
           <w:vertAlign w:val="superscript"/>
         </w:rPr>
-        <w:t xml:space="preserve">14 </w:t>
-      </w:r>
-      <w:r>
-        <w:rPr>
-          <w:sz w:val="24"/>
-        </w:rPr>
-        <w:t>= 4.608</w:t>
-      </w:r>
-      <w:r>
-        <w:rPr>
-          <w:rFonts w:ascii="Cambria Math" w:hAnsi="Cambria Math" w:cs="Cambria Math"/>
-          <w:sz w:val="24"/>
-        </w:rPr>
-        <w:t>⋅</w:t>
-      </w:r>
-      <w:r>
-        <w:rPr>
-          <w:sz w:val="24"/>
-        </w:rPr>
-        <w:t>10</w:t>
-      </w:r>
-      <w:r>
-        <w:rPr>
-          <w:sz w:val="24"/>
-          <w:vertAlign w:val="superscript"/>
-        </w:rPr>
-        <w:t>16</w:t>
-      </w:r>
-      <w:r>
-        <w:rPr>
-          <w:sz w:val="24"/>
-        </w:rPr>
-        <w:t xml:space="preserve"> segundos = 1,46</w:t>
-      </w:r>
-      <w:r>
-        <w:rPr>
-          <w:rFonts w:ascii="Cambria Math" w:hAnsi="Cambria Math" w:cs="Cambria Math"/>
-          <w:sz w:val="24"/>
-        </w:rPr>
-        <w:t>⋅</w:t>
-      </w:r>
-      <w:r>
-        <w:rPr>
-          <w:sz w:val="24"/>
-        </w:rPr>
-        <w:t>10</w:t>
-      </w:r>
-      <w:r>
-        <w:rPr>
-          <w:sz w:val="24"/>
-          <w:vertAlign w:val="superscript"/>
-        </w:rPr>
-        <w:t>9</w:t>
-      </w:r>
-      <w:r>
-        <w:rPr>
-          <w:sz w:val="24"/>
-        </w:rPr>
-        <w:t xml:space="preserve"> años</w:t>
-      </w:r>
-    </w:p>
-    <w:p>
-      <w:pPr>
-        <w:pStyle w:val="Textoindependiente"/>
+        <w:t>3</w:t>
+      </w:r>
+      <w:r>
+        <w:rPr>
+          <w:b/>
+          <w:sz w:val="24"/>
+        </w:rPr>
+        <w:t xml:space="preserve">) (con su pertinente toma de tiempos) y después rellenar una tabla en la que se muestre el tiempo (en milisg.) para n=100, 200, 400, 800, … </w:t>
+      </w:r>
+      <w:r>
         <w:rPr>
           <w:b/>
           <w:sz w:val="24"/>
           <w:lang w:val="en-GB"/>
         </w:rPr>
-      </w:pPr>
-      <w:r>
-        <w:rPr>
-          <w:b/>
-          <w:sz w:val="24"/>
-        </w:rPr>
-        <w:t>Implementar una clase Sustracción4.java con una complejidad O(n</w:t>
-      </w:r>
-      <w:r>
-        <w:rPr>
-          <w:b/>
-          <w:sz w:val="24"/>
-          <w:vertAlign w:val="superscript"/>
-        </w:rPr>
-        <w:t>3</w:t>
-      </w:r>
-      <w:r>
-        <w:rPr>
-          <w:b/>
-          <w:sz w:val="24"/>
-        </w:rPr>
-        <w:t xml:space="preserve">) (con su pertinente toma de tiempos) y después rellenar una tabla en la que se muestre el tiempo (en </w:t>
-      </w:r>
-      <w:proofErr w:type="spellStart"/>
-      <w:r>
-        <w:rPr>
-          <w:b/>
-          <w:sz w:val="24"/>
-        </w:rPr>
-        <w:t>milisg</w:t>
-      </w:r>
-      <w:proofErr w:type="spellEnd"/>
-      <w:r>
-        <w:rPr>
-          <w:b/>
-          <w:sz w:val="24"/>
-        </w:rPr>
-        <w:t xml:space="preserve">.) para n=100, 200, 400, 800, … </w:t>
-      </w:r>
-      <w:r>
-        <w:rPr>
-          <w:b/>
-          <w:sz w:val="24"/>
-          <w:lang w:val="en-GB"/>
-        </w:rPr>
-        <w:t xml:space="preserve">(hasta </w:t>
-      </w:r>
-      <w:proofErr w:type="spellStart"/>
-      <w:r>
-        <w:rPr>
-          <w:b/>
-          <w:sz w:val="24"/>
-          <w:lang w:val="en-GB"/>
-        </w:rPr>
-        <w:t>FdT</w:t>
-      </w:r>
-      <w:proofErr w:type="spellEnd"/>
-      <w:r>
-        <w:rPr>
-          <w:b/>
-          <w:sz w:val="24"/>
-          <w:lang w:val="en-GB"/>
-        </w:rPr>
-        <w:t>).</w:t>
+        <w:t>(hasta FdT).</w:t>
       </w:r>
     </w:p>
     <w:p>
@@ -14146,7 +13793,6 @@
         </w:rPr>
         <w:t xml:space="preserve"> (</w:t>
       </w:r>
-      <w:proofErr w:type="spellStart"/>
       <w:r>
         <w:rPr>
           <w:b/>
@@ -14156,7 +13802,6 @@
         </w:rPr>
         <w:t>int</w:t>
       </w:r>
-      <w:proofErr w:type="spellEnd"/>
       <w:r>
         <w:rPr>
           <w:b/>
@@ -14279,7 +13924,6 @@
           <w:lang w:val="en-GB" w:eastAsia="es-ES"/>
         </w:rPr>
       </w:pPr>
-      <w:proofErr w:type="spellStart"/>
       <w:r>
         <w:rPr>
           <w:b/>
@@ -14288,7 +13932,6 @@
         </w:rPr>
         <w:t>cont</w:t>
       </w:r>
-      <w:proofErr w:type="spellEnd"/>
       <w:r>
         <w:rPr>
           <w:b/>
@@ -14367,7 +14010,6 @@
           <w:lang w:val="en-GB" w:eastAsia="es-ES"/>
         </w:rPr>
       </w:pPr>
-      <w:proofErr w:type="gramStart"/>
       <w:r>
         <w:rPr>
           <w:b/>
@@ -14378,7 +14020,6 @@
         <w:lastRenderedPageBreak/>
         <w:t>for</w:t>
       </w:r>
-      <w:proofErr w:type="gramEnd"/>
       <w:r>
         <w:rPr>
           <w:b/>
@@ -14387,7 +14028,6 @@
         </w:rPr>
         <w:t xml:space="preserve"> (</w:t>
       </w:r>
-      <w:proofErr w:type="spellStart"/>
       <w:r>
         <w:rPr>
           <w:b/>
@@ -14397,7 +14037,6 @@
         </w:rPr>
         <w:t>int</w:t>
       </w:r>
-      <w:proofErr w:type="spellEnd"/>
       <w:r>
         <w:rPr>
           <w:b/>
@@ -14406,7 +14045,6 @@
         </w:rPr>
         <w:t xml:space="preserve"> </w:t>
       </w:r>
-      <w:proofErr w:type="spellStart"/>
       <w:r>
         <w:rPr>
           <w:b/>
@@ -14416,7 +14054,6 @@
         </w:rPr>
         <w:t>i</w:t>
       </w:r>
-      <w:proofErr w:type="spellEnd"/>
       <w:r>
         <w:rPr>
           <w:b/>
@@ -14461,7 +14098,6 @@
         </w:rPr>
         <w:t>&lt;</w:t>
       </w:r>
-      <w:proofErr w:type="spellStart"/>
       <w:r>
         <w:rPr>
           <w:b/>
@@ -14488,7 +14124,6 @@
         </w:rPr>
         <w:t>i</w:t>
       </w:r>
-      <w:proofErr w:type="spellEnd"/>
       <w:r>
         <w:rPr>
           <w:b/>
@@ -14516,7 +14151,6 @@
           <w:lang w:val="en-GB" w:eastAsia="es-ES"/>
         </w:rPr>
       </w:pPr>
-      <w:proofErr w:type="gramStart"/>
       <w:r>
         <w:rPr>
           <w:b/>
@@ -14526,7 +14160,6 @@
         </w:rPr>
         <w:t>for</w:t>
       </w:r>
-      <w:proofErr w:type="gramEnd"/>
       <w:r>
         <w:rPr>
           <w:b/>
@@ -14535,7 +14168,6 @@
         </w:rPr>
         <w:t xml:space="preserve"> (</w:t>
       </w:r>
-      <w:proofErr w:type="spellStart"/>
       <w:r>
         <w:rPr>
           <w:b/>
@@ -14545,7 +14177,6 @@
         </w:rPr>
         <w:t>int</w:t>
       </w:r>
-      <w:proofErr w:type="spellEnd"/>
       <w:r>
         <w:rPr>
           <w:b/>
@@ -14607,7 +14238,6 @@
         </w:rPr>
         <w:t>&lt;</w:t>
       </w:r>
-      <w:proofErr w:type="spellStart"/>
       <w:r>
         <w:rPr>
           <w:b/>
@@ -14634,7 +14264,6 @@
         </w:rPr>
         <w:t>j</w:t>
       </w:r>
-      <w:proofErr w:type="spellEnd"/>
       <w:r>
         <w:rPr>
           <w:b/>
@@ -14663,7 +14292,6 @@
           <w:lang w:eastAsia="es-ES"/>
         </w:rPr>
       </w:pPr>
-      <w:proofErr w:type="spellStart"/>
       <w:r>
         <w:rPr>
           <w:b/>
@@ -14672,7 +14300,6 @@
         </w:rPr>
         <w:t>cont</w:t>
       </w:r>
-      <w:proofErr w:type="spellEnd"/>
       <w:r>
         <w:rPr>
           <w:b/>
@@ -15404,23 +15031,7 @@
           <w:b/>
           <w:sz w:val="24"/>
         </w:rPr>
-        <w:t xml:space="preserve">) (con su pertinente toma de tiempos) y después rellenar una tabla en la que se muestre el tiempo (en </w:t>
-      </w:r>
-      <w:proofErr w:type="spellStart"/>
-      <w:r>
-        <w:rPr>
-          <w:b/>
-          <w:sz w:val="24"/>
-        </w:rPr>
-        <w:t>milisg</w:t>
-      </w:r>
-      <w:proofErr w:type="spellEnd"/>
-      <w:r>
-        <w:rPr>
-          <w:b/>
-          <w:sz w:val="24"/>
-        </w:rPr>
-        <w:t xml:space="preserve">.) para n=30, 32, 34, 36, … </w:t>
+        <w:t xml:space="preserve">) (con su pertinente toma de tiempos) y después rellenar una tabla en la que se muestre el tiempo (en milisg.) para n=30, 32, 34, 36, … </w:t>
       </w:r>
       <w:r>
         <w:rPr>
@@ -15428,25 +15039,7 @@
           <w:sz w:val="24"/>
           <w:lang w:val="en-GB"/>
         </w:rPr>
-        <w:t xml:space="preserve">(hasta </w:t>
-      </w:r>
-      <w:proofErr w:type="spellStart"/>
-      <w:r>
-        <w:rPr>
-          <w:b/>
-          <w:sz w:val="24"/>
-          <w:lang w:val="en-GB"/>
-        </w:rPr>
-        <w:t>FdT</w:t>
-      </w:r>
-      <w:proofErr w:type="spellEnd"/>
-      <w:r>
-        <w:rPr>
-          <w:b/>
-          <w:sz w:val="24"/>
-          <w:lang w:val="en-GB"/>
-        </w:rPr>
-        <w:t>).</w:t>
+        <w:t>(hasta FdT).</w:t>
       </w:r>
     </w:p>
     <w:p>
@@ -15529,7 +15122,6 @@
         </w:rPr>
         <w:t xml:space="preserve"> (</w:t>
       </w:r>
-      <w:proofErr w:type="spellStart"/>
       <w:r>
         <w:rPr>
           <w:b/>
@@ -15539,7 +15131,6 @@
         </w:rPr>
         <w:t>int</w:t>
       </w:r>
-      <w:proofErr w:type="spellEnd"/>
       <w:r>
         <w:rPr>
           <w:b/>
@@ -15662,7 +15253,6 @@
           <w:lang w:val="en-GB" w:eastAsia="es-ES"/>
         </w:rPr>
       </w:pPr>
-      <w:proofErr w:type="spellStart"/>
       <w:r>
         <w:rPr>
           <w:b/>
@@ -15671,7 +15261,6 @@
         </w:rPr>
         <w:t>cont</w:t>
       </w:r>
-      <w:proofErr w:type="spellEnd"/>
       <w:r>
         <w:rPr>
           <w:b/>
@@ -15741,8 +15330,6 @@
           <w:lang w:val="en-GB" w:eastAsia="es-ES"/>
         </w:rPr>
       </w:pPr>
-      <w:proofErr w:type="spellStart"/>
-      <w:proofErr w:type="gramStart"/>
       <w:r>
         <w:rPr>
           <w:color w:val="9CDCFE"/>
@@ -15751,8 +15338,6 @@
         </w:rPr>
         <w:t>cont</w:t>
       </w:r>
-      <w:proofErr w:type="spellEnd"/>
-      <w:proofErr w:type="gramEnd"/>
       <w:r>
         <w:rPr>
           <w:color w:val="D4D4D4"/>
@@ -16425,21 +16010,7 @@
         <w:rPr>
           <w:sz w:val="24"/>
         </w:rPr>
-        <w:t>relación entre el último n del que se tienen tiempos, que es n = 40, y n = 80, tenemos que T(</w:t>
-      </w:r>
-      <w:proofErr w:type="gramStart"/>
-      <w:r>
-        <w:rPr>
-          <w:sz w:val="24"/>
-        </w:rPr>
-        <w:t>80)/</w:t>
-      </w:r>
-      <w:proofErr w:type="gramEnd"/>
-      <w:r>
-        <w:rPr>
-          <w:sz w:val="24"/>
-        </w:rPr>
-        <w:t xml:space="preserve">T(40) </w:t>
+        <w:t xml:space="preserve">relación entre el último n del que se tienen tiempos, que es n = 40, y n = 80, tenemos que T(80)/T(40) </w:t>
       </w:r>
       <w:r>
         <w:rPr>
@@ -16784,32 +16355,38 @@
         <w:rPr>
           <w:sz w:val="24"/>
         </w:rPr>
-        <w:t xml:space="preserve">Para división 3 la complejidad es </w:t>
-      </w:r>
-      <w:proofErr w:type="gramStart"/>
-      <w:r>
-        <w:rPr>
-          <w:sz w:val="24"/>
-        </w:rPr>
-        <w:t>O(</w:t>
-      </w:r>
-      <w:proofErr w:type="gramEnd"/>
-      <w:r>
-        <w:rPr>
-          <w:sz w:val="24"/>
-        </w:rPr>
-        <w:t>1), por lo que a=2, b=2 y k=0, como a</w:t>
-      </w:r>
-      <w:r>
-        <w:rPr>
-          <w:sz w:val="24"/>
-        </w:rPr>
-        <w:t>&gt;</w:t>
-      </w:r>
-      <w:proofErr w:type="spellStart"/>
-      <w:r>
-        <w:rPr>
-          <w:sz w:val="24"/>
+        <w:t>Para división 3 la complejidad es O(1), por lo que a=2, b=2 y k=0, como a</w:t>
+      </w:r>
+      <w:r>
+        <w:rPr>
+          <w:sz w:val="24"/>
+        </w:rPr>
+        <w:t>&gt;b</w:t>
+      </w:r>
+      <w:r>
+        <w:rPr>
+          <w:sz w:val="24"/>
+          <w:vertAlign w:val="superscript"/>
+        </w:rPr>
+        <w:t>k</w:t>
+      </w:r>
+      <w:r>
+        <w:rPr>
+          <w:sz w:val="24"/>
+        </w:rPr>
+        <w:t>, la complejidad temporal es O(n</w:t>
+      </w:r>
+      <w:r>
+        <w:rPr>
+          <w:sz w:val="24"/>
+          <w:vertAlign w:val="superscript"/>
+        </w:rPr>
+        <w:t>log</w:t>
+      </w:r>
+      <w:r>
+        <w:rPr>
+          <w:sz w:val="24"/>
+          <w:vertAlign w:val="subscript"/>
         </w:rPr>
         <w:t>b</w:t>
       </w:r>
@@ -16818,170 +16395,107 @@
           <w:sz w:val="24"/>
           <w:vertAlign w:val="superscript"/>
         </w:rPr>
+        <w:t>a</w:t>
+      </w:r>
+      <w:r>
+        <w:rPr>
+          <w:sz w:val="24"/>
+        </w:rPr>
+        <w:t>) que es O(n</w:t>
+      </w:r>
+      <w:r>
+        <w:rPr>
+          <w:sz w:val="24"/>
+          <w:vertAlign w:val="superscript"/>
+        </w:rPr>
+        <w:t>log</w:t>
+      </w:r>
+      <w:r>
+        <w:rPr>
+          <w:sz w:val="24"/>
+          <w:vertAlign w:val="subscript"/>
+        </w:rPr>
+        <w:t>2</w:t>
+      </w:r>
+      <w:r>
+        <w:rPr>
+          <w:sz w:val="24"/>
+          <w:vertAlign w:val="superscript"/>
+        </w:rPr>
+        <w:t>2</w:t>
+      </w:r>
+      <w:r>
+        <w:rPr>
+          <w:sz w:val="24"/>
+        </w:rPr>
+        <w:t>)</w:t>
+      </w:r>
+      <w:r>
+        <w:rPr>
+          <w:sz w:val="24"/>
+        </w:rPr>
+        <w:t>, O(n)</w:t>
+      </w:r>
+      <w:r>
+        <w:rPr>
+          <w:sz w:val="24"/>
+        </w:rPr>
+        <w:t>.</w:t>
+      </w:r>
+    </w:p>
+    <w:p>
+      <w:pPr>
+        <w:pStyle w:val="Textoindependiente"/>
+        <w:rPr>
+          <w:b/>
+          <w:sz w:val="24"/>
+          <w:lang w:val="en-GB"/>
+        </w:rPr>
+      </w:pPr>
+      <w:r>
+        <w:rPr>
+          <w:b/>
+          <w:sz w:val="24"/>
+        </w:rPr>
+        <w:t>Implementar una clase Division4.java con una complejidad O(n</w:t>
+      </w:r>
+      <w:r>
+        <w:rPr>
+          <w:b/>
+          <w:sz w:val="24"/>
+          <w:vertAlign w:val="superscript"/>
+        </w:rPr>
+        <w:t>2</w:t>
+      </w:r>
+      <w:r>
+        <w:rPr>
+          <w:b/>
+          <w:sz w:val="24"/>
+        </w:rPr>
+        <w:t>) (con a&lt;b</w:t>
+      </w:r>
+      <w:r>
+        <w:rPr>
+          <w:b/>
+          <w:sz w:val="24"/>
+          <w:vertAlign w:val="superscript"/>
+        </w:rPr>
         <w:t>k</w:t>
       </w:r>
-      <w:proofErr w:type="spellEnd"/>
-      <w:r>
-        <w:rPr>
-          <w:sz w:val="24"/>
-        </w:rPr>
-        <w:t>, la complejidad temporal es O(</w:t>
-      </w:r>
-      <w:proofErr w:type="spellStart"/>
-      <w:r>
-        <w:rPr>
-          <w:sz w:val="24"/>
-        </w:rPr>
-        <w:t>n</w:t>
-      </w:r>
-      <w:r>
-        <w:rPr>
-          <w:sz w:val="24"/>
-          <w:vertAlign w:val="superscript"/>
-        </w:rPr>
-        <w:t>log</w:t>
-      </w:r>
-      <w:r>
-        <w:rPr>
-          <w:sz w:val="24"/>
-          <w:vertAlign w:val="subscript"/>
-        </w:rPr>
-        <w:t>b</w:t>
-      </w:r>
-      <w:r>
-        <w:rPr>
-          <w:sz w:val="24"/>
-          <w:vertAlign w:val="superscript"/>
-        </w:rPr>
-        <w:t>a</w:t>
-      </w:r>
-      <w:proofErr w:type="spellEnd"/>
-      <w:r>
-        <w:rPr>
-          <w:sz w:val="24"/>
-        </w:rPr>
-        <w:t>) que es O(n</w:t>
-      </w:r>
-      <w:r>
-        <w:rPr>
-          <w:sz w:val="24"/>
-          <w:vertAlign w:val="superscript"/>
-        </w:rPr>
-        <w:t>log</w:t>
-      </w:r>
-      <w:r>
-        <w:rPr>
-          <w:sz w:val="24"/>
-          <w:vertAlign w:val="subscript"/>
-        </w:rPr>
-        <w:t>2</w:t>
-      </w:r>
-      <w:r>
-        <w:rPr>
-          <w:sz w:val="24"/>
-          <w:vertAlign w:val="superscript"/>
-        </w:rPr>
-        <w:t>2</w:t>
-      </w:r>
-      <w:r>
-        <w:rPr>
-          <w:sz w:val="24"/>
-        </w:rPr>
-        <w:t>)</w:t>
-      </w:r>
-      <w:r>
-        <w:rPr>
-          <w:sz w:val="24"/>
-        </w:rPr>
-        <w:t>, O(n)</w:t>
-      </w:r>
-      <w:r>
-        <w:rPr>
-          <w:sz w:val="24"/>
-        </w:rPr>
-        <w:t>.</w:t>
-      </w:r>
-    </w:p>
-    <w:p>
-      <w:pPr>
-        <w:pStyle w:val="Textoindependiente"/>
+      <w:r>
+        <w:rPr>
+          <w:b/>
+          <w:sz w:val="24"/>
+        </w:rPr>
+        <w:t xml:space="preserve">) y la pertinente toma de tiempos. Después rellenar una tabla en la que se muestre el tiempo (en milisg.) para n=1000, 2000, 4000, 8000, … </w:t>
+      </w:r>
+      <w:r>
         <w:rPr>
           <w:b/>
           <w:sz w:val="24"/>
           <w:lang w:val="en-GB"/>
         </w:rPr>
-      </w:pPr>
-      <w:r>
-        <w:rPr>
-          <w:b/>
-          <w:sz w:val="24"/>
-        </w:rPr>
-        <w:t>Implementar una clase Division4.java con una complejidad O(n</w:t>
-      </w:r>
-      <w:r>
-        <w:rPr>
-          <w:b/>
-          <w:sz w:val="24"/>
-          <w:vertAlign w:val="superscript"/>
-        </w:rPr>
-        <w:t>2</w:t>
-      </w:r>
-      <w:r>
-        <w:rPr>
-          <w:b/>
-          <w:sz w:val="24"/>
-        </w:rPr>
-        <w:t>) (con a&lt;</w:t>
-      </w:r>
-      <w:proofErr w:type="spellStart"/>
-      <w:r>
-        <w:rPr>
-          <w:b/>
-          <w:sz w:val="24"/>
-        </w:rPr>
-        <w:t>b</w:t>
-      </w:r>
-      <w:r>
-        <w:rPr>
-          <w:b/>
-          <w:sz w:val="24"/>
-          <w:vertAlign w:val="superscript"/>
-        </w:rPr>
-        <w:t>k</w:t>
-      </w:r>
-      <w:proofErr w:type="spellEnd"/>
-      <w:r>
-        <w:rPr>
-          <w:b/>
-          <w:sz w:val="24"/>
-        </w:rPr>
-        <w:t xml:space="preserve">) y la pertinente toma de tiempos. Después rellenar una tabla en la que se muestre el tiempo (en milisg.) para n=1000, 2000, 4000, 8000, … </w:t>
-      </w:r>
-      <w:r>
-        <w:rPr>
-          <w:b/>
-          <w:sz w:val="24"/>
-          <w:lang w:val="en-GB"/>
-        </w:rPr>
-        <w:t xml:space="preserve">(hasta </w:t>
-      </w:r>
-      <w:proofErr w:type="spellStart"/>
-      <w:r>
-        <w:rPr>
-          <w:b/>
-          <w:sz w:val="24"/>
-          <w:lang w:val="en-GB"/>
-        </w:rPr>
-        <w:t>FdT</w:t>
-      </w:r>
-      <w:proofErr w:type="spellEnd"/>
-      <w:r>
-        <w:rPr>
-          <w:b/>
-          <w:sz w:val="24"/>
-          <w:lang w:val="en-GB"/>
-        </w:rPr>
-        <w:t>).</w:t>
+        <w:t>(hasta FdT).</w:t>
       </w:r>
     </w:p>
     <w:p>
@@ -17064,7 +16578,6 @@
         </w:rPr>
         <w:t xml:space="preserve"> (</w:t>
       </w:r>
-      <w:proofErr w:type="spellStart"/>
       <w:r>
         <w:rPr>
           <w:b/>
@@ -17074,7 +16587,6 @@
         </w:rPr>
         <w:t>int</w:t>
       </w:r>
-      <w:proofErr w:type="spellEnd"/>
       <w:r>
         <w:rPr>
           <w:b/>
@@ -17187,7 +16699,6 @@
           <w:lang w:eastAsia="es-ES"/>
         </w:rPr>
       </w:pPr>
-      <w:proofErr w:type="spellStart"/>
       <w:r>
         <w:rPr>
           <w:b/>
@@ -17196,7 +16707,6 @@
         </w:rPr>
         <w:t>cont</w:t>
       </w:r>
-      <w:proofErr w:type="spellEnd"/>
       <w:r>
         <w:rPr>
           <w:b/>
@@ -17265,7 +16775,6 @@
           <w:lang w:val="en-GB" w:eastAsia="es-ES"/>
         </w:rPr>
       </w:pPr>
-      <w:proofErr w:type="gramStart"/>
       <w:r>
         <w:rPr>
           <w:b/>
@@ -17275,7 +16784,6 @@
         </w:rPr>
         <w:t>for</w:t>
       </w:r>
-      <w:proofErr w:type="gramEnd"/>
       <w:r>
         <w:rPr>
           <w:b/>
@@ -17284,7 +16792,6 @@
         </w:rPr>
         <w:t xml:space="preserve"> (</w:t>
       </w:r>
-      <w:proofErr w:type="spellStart"/>
       <w:r>
         <w:rPr>
           <w:b/>
@@ -17294,7 +16801,6 @@
         </w:rPr>
         <w:t>int</w:t>
       </w:r>
-      <w:proofErr w:type="spellEnd"/>
       <w:r>
         <w:rPr>
           <w:b/>
@@ -17303,7 +16809,6 @@
         </w:rPr>
         <w:t xml:space="preserve"> </w:t>
       </w:r>
-      <w:proofErr w:type="spellStart"/>
       <w:r>
         <w:rPr>
           <w:b/>
@@ -17313,7 +16818,6 @@
         </w:rPr>
         <w:t>i</w:t>
       </w:r>
-      <w:proofErr w:type="spellEnd"/>
       <w:r>
         <w:rPr>
           <w:b/>
@@ -17349,7 +16853,6 @@
         </w:rPr>
         <w:t>&lt;</w:t>
       </w:r>
-      <w:proofErr w:type="spellStart"/>
       <w:r>
         <w:rPr>
           <w:b/>
@@ -17358,7 +16861,6 @@
         </w:rPr>
         <w:t>n;i</w:t>
       </w:r>
-      <w:proofErr w:type="spellEnd"/>
       <w:r>
         <w:rPr>
           <w:b/>
@@ -17418,7 +16920,6 @@
           <w:lang w:val="en-GB" w:eastAsia="es-ES"/>
         </w:rPr>
       </w:pPr>
-      <w:proofErr w:type="gramStart"/>
       <w:r>
         <w:rPr>
           <w:b/>
@@ -17428,7 +16929,6 @@
         </w:rPr>
         <w:t>for</w:t>
       </w:r>
-      <w:proofErr w:type="gramEnd"/>
       <w:r>
         <w:rPr>
           <w:b/>
@@ -17437,7 +16937,6 @@
         </w:rPr>
         <w:t xml:space="preserve"> (</w:t>
       </w:r>
-      <w:proofErr w:type="spellStart"/>
       <w:r>
         <w:rPr>
           <w:b/>
@@ -17447,7 +16946,6 @@
         </w:rPr>
         <w:t>int</w:t>
       </w:r>
-      <w:proofErr w:type="spellEnd"/>
       <w:r>
         <w:rPr>
           <w:b/>
@@ -17456,7 +16954,6 @@
         </w:rPr>
         <w:t xml:space="preserve"> </w:t>
       </w:r>
-      <w:proofErr w:type="spellStart"/>
       <w:r>
         <w:rPr>
           <w:b/>
@@ -17466,7 +16963,6 @@
         </w:rPr>
         <w:t>i</w:t>
       </w:r>
-      <w:proofErr w:type="spellEnd"/>
       <w:r>
         <w:rPr>
           <w:b/>
@@ -17502,7 +16998,6 @@
         </w:rPr>
         <w:t>&lt;</w:t>
       </w:r>
-      <w:proofErr w:type="spellStart"/>
       <w:r>
         <w:rPr>
           <w:b/>
@@ -17511,7 +17006,6 @@
         </w:rPr>
         <w:t>n;i</w:t>
       </w:r>
-      <w:proofErr w:type="spellEnd"/>
       <w:r>
         <w:rPr>
           <w:b/>
@@ -17802,15 +17296,7 @@
           <w:b/>
           <w:sz w:val="24"/>
         </w:rPr>
-        <w:t>) (con a&gt;</w:t>
-      </w:r>
-      <w:proofErr w:type="spellStart"/>
-      <w:r>
-        <w:rPr>
-          <w:b/>
-          <w:sz w:val="24"/>
-        </w:rPr>
-        <w:t>b</w:t>
+        <w:t>) (con a&gt;b</w:t>
       </w:r>
       <w:r>
         <w:rPr>
@@ -17820,7 +17306,6 @@
         </w:rPr>
         <w:t>k</w:t>
       </w:r>
-      <w:proofErr w:type="spellEnd"/>
       <w:r>
         <w:rPr>
           <w:b/>
@@ -17834,25 +17319,7 @@
           <w:sz w:val="24"/>
           <w:lang w:val="en-GB"/>
         </w:rPr>
-        <w:t xml:space="preserve">(hasta </w:t>
-      </w:r>
-      <w:proofErr w:type="spellStart"/>
-      <w:r>
-        <w:rPr>
-          <w:b/>
-          <w:sz w:val="24"/>
-          <w:lang w:val="en-GB"/>
-        </w:rPr>
-        <w:t>FdT</w:t>
-      </w:r>
-      <w:proofErr w:type="spellEnd"/>
-      <w:r>
-        <w:rPr>
-          <w:b/>
-          <w:sz w:val="24"/>
-          <w:lang w:val="en-GB"/>
-        </w:rPr>
-        <w:t>).</w:t>
+        <w:t>(hasta FdT).</w:t>
       </w:r>
     </w:p>
     <w:p>
@@ -17935,7 +17402,6 @@
         </w:rPr>
         <w:t xml:space="preserve"> (</w:t>
       </w:r>
-      <w:proofErr w:type="spellStart"/>
       <w:r>
         <w:rPr>
           <w:b/>
@@ -17945,7 +17411,6 @@
         </w:rPr>
         <w:t>int</w:t>
       </w:r>
-      <w:proofErr w:type="spellEnd"/>
       <w:r>
         <w:rPr>
           <w:b/>
@@ -18058,7 +17523,6 @@
           <w:lang w:val="en-GB" w:eastAsia="es-ES"/>
         </w:rPr>
       </w:pPr>
-      <w:proofErr w:type="spellStart"/>
       <w:r>
         <w:rPr>
           <w:b/>
@@ -18067,7 +17531,6 @@
         </w:rPr>
         <w:t>cont</w:t>
       </w:r>
-      <w:proofErr w:type="spellEnd"/>
       <w:r>
         <w:rPr>
           <w:b/>
@@ -18136,7 +17599,6 @@
           <w:lang w:val="en-GB" w:eastAsia="es-ES"/>
         </w:rPr>
       </w:pPr>
-      <w:proofErr w:type="spellStart"/>
       <w:r>
         <w:rPr>
           <w:color w:val="CCCCCC"/>
@@ -18145,40 +17607,21 @@
         </w:rPr>
         <w:t>cont</w:t>
       </w:r>
-      <w:proofErr w:type="spellEnd"/>
       <w:r>
         <w:rPr>
           <w:color w:val="D4D4D4"/>
           <w:sz w:val="24"/>
           <w:lang w:val="en-GB" w:eastAsia="es-ES"/>
         </w:rPr>
-        <w:t>+</w:t>
-      </w:r>
-      <w:proofErr w:type="gramStart"/>
-      <w:r>
-        <w:rPr>
-          <w:color w:val="D4D4D4"/>
+        <w:t>++</w:t>
+      </w:r>
+      <w:r>
+        <w:rPr>
+          <w:color w:val="CCCCCC"/>
           <w:sz w:val="24"/>
           <w:lang w:val="en-GB" w:eastAsia="es-ES"/>
         </w:rPr>
-        <w:t>+</w:t>
-      </w:r>
-      <w:r>
-        <w:rPr>
-          <w:color w:val="CCCCCC"/>
-          <w:sz w:val="24"/>
-          <w:lang w:val="en-GB" w:eastAsia="es-ES"/>
-        </w:rPr>
-        <w:t xml:space="preserve"> ;</w:t>
-      </w:r>
-      <w:proofErr w:type="gramEnd"/>
-      <w:r>
-        <w:rPr>
-          <w:color w:val="CCCCCC"/>
-          <w:sz w:val="24"/>
-          <w:lang w:val="en-GB" w:eastAsia="es-ES"/>
-        </w:rPr>
-        <w:t xml:space="preserve"> </w:t>
+        <w:t xml:space="preserve"> ; </w:t>
       </w:r>
       <w:r>
         <w:rPr>
@@ -18998,23 +18441,7 @@
           <w:b/>
           <w:sz w:val="24"/>
         </w:rPr>
-        <w:t>java p3p.PuntosTrivial nombreFichero // [datos32.txt</w:t>
-      </w:r>
-      <w:proofErr w:type="gramStart"/>
-      <w:r>
-        <w:rPr>
-          <w:b/>
-          <w:sz w:val="24"/>
-        </w:rPr>
-        <w:t xml:space="preserve"> ..</w:t>
-      </w:r>
-      <w:proofErr w:type="gramEnd"/>
-      <w:r>
-        <w:rPr>
-          <w:b/>
-          <w:sz w:val="24"/>
-        </w:rPr>
-        <w:t xml:space="preserve"> datos8192.txt]</w:t>
+        <w:t>java p3p.PuntosTrivial nombreFichero // [datos32.txt .. datos8192.txt]</w:t>
       </w:r>
     </w:p>
     <w:p>
@@ -19650,23 +19077,7 @@
           <w:b/>
           <w:sz w:val="24"/>
         </w:rPr>
-        <w:t xml:space="preserve">Hacer una clase p3p.PuntosDyVTiempos.java que tras generar de forma aleatoria los n puntos, posteriormente calcule el tiempo de ejecución del algoritmo </w:t>
-      </w:r>
-      <w:proofErr w:type="spellStart"/>
-      <w:r>
-        <w:rPr>
-          <w:b/>
-          <w:sz w:val="24"/>
-        </w:rPr>
-        <w:t>DyV</w:t>
-      </w:r>
-      <w:proofErr w:type="spellEnd"/>
-      <w:r>
-        <w:rPr>
-          <w:b/>
-          <w:sz w:val="24"/>
-        </w:rPr>
-        <w:t>:</w:t>
+        <w:t>Hacer una clase p3p.PuntosDyVTiempos.java que tras generar de forma aleatoria los n puntos, posteriormente calcule el tiempo de ejecución del algoritmo DyV:</w:t>
       </w:r>
     </w:p>
     <w:p>
@@ -20286,12 +19697,14 @@
         <w:pStyle w:val="Textoindependiente"/>
         <w:rPr>
           <w:b/>
-          <w:sz w:val="24"/>
-        </w:rPr>
-      </w:pPr>
-      <w:r>
-        <w:rPr>
-          <w:b/>
+          <w:color w:val="FF0000"/>
+          <w:sz w:val="24"/>
+        </w:rPr>
+      </w:pPr>
+      <w:r>
+        <w:rPr>
+          <w:b/>
+          <w:color w:val="FF0000"/>
           <w:sz w:val="24"/>
         </w:rPr>
         <w:t>Opcional, hacer una clase p3p.PuntosTodosDyV.java que resuelva el problema planteado para cualquier número de puntos n&gt;=3.</w:t>
@@ -20302,12 +19715,14 @@
         <w:pStyle w:val="Textoindependiente"/>
         <w:rPr>
           <w:b/>
-          <w:sz w:val="24"/>
-        </w:rPr>
-      </w:pPr>
-      <w:r>
-        <w:rPr>
-          <w:b/>
+          <w:color w:val="FF0000"/>
+          <w:sz w:val="24"/>
+        </w:rPr>
+      </w:pPr>
+      <w:r>
+        <w:rPr>
+          <w:b/>
+          <w:color w:val="FF0000"/>
           <w:sz w:val="24"/>
         </w:rPr>
         <w:t>Pruebe el buen funcionamiento de p3p.PuntosTodosDyV.java para: “datos100.txt</w:t>
@@ -20316,6 +19731,7 @@
       <w:r>
         <w:rPr>
           <w:b/>
+          <w:color w:val="FF0000"/>
           <w:sz w:val="24"/>
         </w:rPr>
         <w:t>” :</w:t>
@@ -20324,76 +19740,66 @@
       <w:r>
         <w:rPr>
           <w:b/>
-          <w:sz w:val="24"/>
-        </w:rPr>
-        <w:t xml:space="preserve"> para este caso la solución ha de ser: PUNTOS MÁS CERCANOS: [40.203173, 17.809812] [39.518531, 18.864816] SU DISTANCIA MÍNIMA= 1.257684</w:t>
-      </w:r>
-    </w:p>
-    <w:p>
-      <w:pPr>
-        <w:pStyle w:val="Textoindependiente"/>
-        <w:rPr>
-          <w:b/>
-          <w:sz w:val="24"/>
-        </w:rPr>
-      </w:pPr>
-      <w:r>
-        <w:rPr>
-          <w:b/>
-          <w:sz w:val="24"/>
-        </w:rPr>
-        <w:t>“datos1000.txt</w:t>
-      </w:r>
-      <w:proofErr w:type="gramStart"/>
-      <w:r>
-        <w:rPr>
-          <w:b/>
-          <w:sz w:val="24"/>
-        </w:rPr>
-        <w:t>” :</w:t>
-      </w:r>
-      <w:proofErr w:type="gramEnd"/>
-      <w:r>
-        <w:rPr>
-          <w:b/>
-          <w:sz w:val="24"/>
-        </w:rPr>
-        <w:t xml:space="preserve"> para este caso la solución ha de ser: PUNTOS MÁS CERCANOS: [8.036015, 65.015139] [8.005602, 64.992083] SU DISTANCIA MÍNIMA= 0.038165</w:t>
-      </w:r>
-    </w:p>
-    <w:p>
-      <w:pPr>
-        <w:pStyle w:val="Textoindependiente"/>
-        <w:rPr>
-          <w:b/>
-        </w:rPr>
-      </w:pPr>
-      <w:r>
-        <w:rPr>
-          <w:b/>
-          <w:sz w:val="24"/>
-        </w:rPr>
-        <w:t>“datos10000.txt</w:t>
-      </w:r>
-      <w:proofErr w:type="gramStart"/>
-      <w:r>
-        <w:rPr>
-          <w:b/>
-          <w:sz w:val="24"/>
-        </w:rPr>
-        <w:t>” :</w:t>
-      </w:r>
-      <w:proofErr w:type="gramEnd"/>
-      <w:r>
-        <w:rPr>
-          <w:b/>
-          <w:sz w:val="24"/>
-        </w:rPr>
-        <w:t xml:space="preserve"> para este caso la solución ha de ser: PUNTOS MÁS CERCANOS: [73.085395, 31.480901] [73.085113, 31.479733] SU DISTANCIA MÍNIMA= 0.0</w:t>
-      </w:r>
-      <w:r>
-        <w:rPr>
-          <w:b/>
+          <w:color w:val="FF0000"/>
+          <w:sz w:val="24"/>
+        </w:rPr>
+        <w:t xml:space="preserve"> para este caso la solución ha de ser: PUNTOS MÁS CERC</w:t>
+      </w:r>
+      <w:r>
+        <w:rPr>
+          <w:b/>
+          <w:color w:val="FF0000"/>
+          <w:sz w:val="24"/>
+        </w:rPr>
+        <w:t xml:space="preserve"> </w:t>
+      </w:r>
+      <w:r>
+        <w:rPr>
+          <w:b/>
+          <w:color w:val="FF0000"/>
+          <w:sz w:val="24"/>
+        </w:rPr>
+        <w:t>ANOS: [40.203173, 17.809812] [39.518531, 18.864816] SU DISTANCIA MÍNIMA= 1.257684</w:t>
+      </w:r>
+    </w:p>
+    <w:p>
+      <w:pPr>
+        <w:pStyle w:val="Textoindependiente"/>
+        <w:rPr>
+          <w:b/>
+          <w:color w:val="FF0000"/>
+          <w:sz w:val="24"/>
+        </w:rPr>
+      </w:pPr>
+      <w:r>
+        <w:rPr>
+          <w:b/>
+          <w:color w:val="FF0000"/>
+          <w:sz w:val="24"/>
+        </w:rPr>
+        <w:t>“datos1000.txt” : para este caso la solución ha de ser: PUNTOS MÁS CERCANOS: [8.036015, 65.015139] [8.005602, 64.992083] SU DISTANCIA MÍNIMA= 0.038165</w:t>
+      </w:r>
+    </w:p>
+    <w:p>
+      <w:pPr>
+        <w:pStyle w:val="Textoindependiente"/>
+        <w:rPr>
+          <w:b/>
+          <w:color w:val="FF0000"/>
+        </w:rPr>
+      </w:pPr>
+      <w:r>
+        <w:rPr>
+          <w:b/>
+          <w:color w:val="FF0000"/>
+          <w:sz w:val="24"/>
+        </w:rPr>
+        <w:t>“datos10000.txt” : para este caso la solución ha de ser: PUNTOS MÁS CERCANOS: [73.085395, 31.480901] [73.085113, 31.479733] SU DISTANCIA MÍNIMA= 0.0</w:t>
+      </w:r>
+      <w:r>
+        <w:rPr>
+          <w:b/>
+          <w:color w:val="FF0000"/>
         </w:rPr>
         <w:t>01202</w:t>
       </w:r>
@@ -20459,18 +19865,8 @@
           <w:sz w:val="24"/>
           <w:szCs w:val="24"/>
         </w:rPr>
-        <w:t xml:space="preserve">Implementar una clase ColoreoGrafo.java, de modo que con la clase proporcionada Devorador.java podamos calcular una solución y visualizarla con el módulo proporcionado en Python. Se debe añadir el JAR provisto al </w:t>
-      </w:r>
-      <w:proofErr w:type="spellStart"/>
-      <w:r>
-        <w:rPr>
-          <w:b/>
-          <w:sz w:val="24"/>
-          <w:szCs w:val="24"/>
-        </w:rPr>
-        <w:t>build</w:t>
-      </w:r>
-      <w:proofErr w:type="spellEnd"/>
+        <w:t>Implementar una clase ColoreoGrafo.java, de modo que con la clase proporcionada Devorador.java podamos calcular una solución y visualizarla con el módulo proporcionado en Python. Se debe añadir el JAR provisto al build path para que este último funcione.</w:t>
+      </w:r>
       <w:r>
         <w:rPr>
           <w:b/>
@@ -20479,27 +19875,176 @@
         </w:rPr>
         <w:t xml:space="preserve"> </w:t>
       </w:r>
-      <w:proofErr w:type="spellStart"/>
-      <w:r>
-        <w:rPr>
-          <w:b/>
-          <w:sz w:val="24"/>
-          <w:szCs w:val="24"/>
-        </w:rPr>
-        <w:t>path</w:t>
-      </w:r>
-      <w:proofErr w:type="spellEnd"/>
-      <w:r>
-        <w:rPr>
-          <w:b/>
-          <w:sz w:val="24"/>
-          <w:szCs w:val="24"/>
-        </w:rPr>
-        <w:t xml:space="preserve"> para que este último funcione.</w:t>
-      </w:r>
-      <w:r>
-        <w:rPr>
-          <w:b/>
+      <w:r>
+        <w:rPr>
+          <w:b/>
+          <w:sz w:val="24"/>
+          <w:szCs w:val="24"/>
+        </w:rPr>
+        <w:t>Razone convenientemente la complejidad temporal del algoritmo implementado.</w:t>
+      </w:r>
+    </w:p>
+    <w:p>
+      <w:pPr>
+        <w:pStyle w:val="Textoindependiente"/>
+        <w:rPr>
+          <w:sz w:val="24"/>
+          <w:szCs w:val="24"/>
+        </w:rPr>
+      </w:pPr>
+      <w:r>
+        <w:rPr>
+          <w:sz w:val="24"/>
+          <w:szCs w:val="24"/>
+        </w:rPr>
+        <w:t xml:space="preserve">El algoritmo recorre todos los nodos del grafo </w:t>
+      </w:r>
+      <w:r>
+        <w:rPr>
+          <w:sz w:val="24"/>
+          <w:szCs w:val="24"/>
+        </w:rPr>
+        <w:t>y para</w:t>
+      </w:r>
+      <w:r>
+        <w:rPr>
+          <w:sz w:val="24"/>
+          <w:szCs w:val="24"/>
+        </w:rPr>
+        <w:t xml:space="preserve"> cada nodo se recorren sus vecinos utilizando la lista de ad</w:t>
+      </w:r>
+      <w:r>
+        <w:rPr>
+          <w:sz w:val="24"/>
+          <w:szCs w:val="24"/>
+        </w:rPr>
+        <w:t>yacencia del map.</w:t>
+      </w:r>
+    </w:p>
+    <w:p>
+      <w:pPr>
+        <w:pStyle w:val="Textoindependiente"/>
+        <w:rPr>
+          <w:sz w:val="24"/>
+          <w:szCs w:val="24"/>
+        </w:rPr>
+      </w:pPr>
+      <w:r>
+        <w:rPr>
+          <w:sz w:val="24"/>
+          <w:szCs w:val="24"/>
+        </w:rPr>
+        <w:t>Si n es el número de nodos y A</w:t>
+      </w:r>
+      <w:r>
+        <w:rPr>
+          <w:sz w:val="24"/>
+          <w:szCs w:val="24"/>
+        </w:rPr>
+        <w:t xml:space="preserve"> el número de aristas</w:t>
+      </w:r>
+      <w:r>
+        <w:rPr>
+          <w:sz w:val="24"/>
+          <w:szCs w:val="24"/>
+        </w:rPr>
+        <w:t>, recorrer todos los nodos</w:t>
+      </w:r>
+      <w:r>
+        <w:rPr>
+          <w:sz w:val="24"/>
+          <w:szCs w:val="24"/>
+        </w:rPr>
+        <w:t xml:space="preserve"> tiene co</w:t>
+      </w:r>
+      <w:r>
+        <w:rPr>
+          <w:sz w:val="24"/>
+          <w:szCs w:val="24"/>
+        </w:rPr>
+        <w:t xml:space="preserve">ste </w:t>
+      </w:r>
+      <w:r>
+        <w:rPr>
+          <w:sz w:val="24"/>
+          <w:szCs w:val="24"/>
+        </w:rPr>
+        <w:t xml:space="preserve">O(n), mientras que </w:t>
+      </w:r>
+      <w:r>
+        <w:rPr>
+          <w:sz w:val="24"/>
+          <w:szCs w:val="24"/>
+        </w:rPr>
+        <w:t>recorrer</w:t>
+      </w:r>
+      <w:r>
+        <w:rPr>
+          <w:sz w:val="24"/>
+          <w:szCs w:val="24"/>
+        </w:rPr>
+        <w:t xml:space="preserve"> los vecinos de cada nodo equivale a </w:t>
+      </w:r>
+      <w:r>
+        <w:rPr>
+          <w:sz w:val="24"/>
+          <w:szCs w:val="24"/>
+        </w:rPr>
+        <w:t xml:space="preserve">recorrer las aristas del </w:t>
+      </w:r>
+      <w:r>
+        <w:rPr>
+          <w:sz w:val="24"/>
+          <w:szCs w:val="24"/>
+        </w:rPr>
+        <w:t>nodo</w:t>
+      </w:r>
+      <w:r>
+        <w:rPr>
+          <w:sz w:val="24"/>
+          <w:szCs w:val="24"/>
+        </w:rPr>
+        <w:t xml:space="preserve"> (de cada arista sale un nodo</w:t>
+      </w:r>
+      <w:r>
+        <w:rPr>
+          <w:sz w:val="24"/>
+          <w:szCs w:val="24"/>
+        </w:rPr>
+        <w:t xml:space="preserve"> vecino), p</w:t>
+      </w:r>
+      <w:r>
+        <w:rPr>
+          <w:sz w:val="24"/>
+          <w:szCs w:val="24"/>
+        </w:rPr>
+        <w:t>or tanto, la comp</w:t>
+      </w:r>
+      <w:r>
+        <w:rPr>
+          <w:sz w:val="24"/>
+          <w:szCs w:val="24"/>
+        </w:rPr>
+        <w:t>lejidad total del algoritmo es O(n+A)</w:t>
+      </w:r>
+    </w:p>
+    <w:p>
+      <w:pPr>
+        <w:pStyle w:val="Textoindependiente"/>
+        <w:rPr>
+          <w:sz w:val="24"/>
+          <w:szCs w:val="24"/>
+        </w:rPr>
+      </w:pPr>
+      <w:r>
+        <w:rPr>
+          <w:sz w:val="24"/>
+          <w:szCs w:val="24"/>
+        </w:rPr>
+        <w:t>En grafos dispersos, es decir, con pocas aristas (donde A</w:t>
+      </w:r>
+      <w:r>
+        <w:rPr>
           <w:sz w:val="24"/>
           <w:szCs w:val="24"/>
         </w:rPr>
@@ -20507,213 +20052,6 @@
       </w:r>
       <w:r>
         <w:rPr>
-          <w:b/>
-          <w:sz w:val="24"/>
-          <w:szCs w:val="24"/>
-        </w:rPr>
-        <w:t>Razone convenientemente la complejidad temporal del algoritmo implementado.</w:t>
-      </w:r>
-    </w:p>
-    <w:p>
-      <w:pPr>
-        <w:pStyle w:val="Textoindependiente"/>
-        <w:rPr>
-          <w:sz w:val="24"/>
-          <w:szCs w:val="24"/>
-        </w:rPr>
-      </w:pPr>
-      <w:r>
-        <w:rPr>
-          <w:sz w:val="24"/>
-          <w:szCs w:val="24"/>
-        </w:rPr>
-        <w:t xml:space="preserve">El algoritmo recorre todos los nodos del grafo </w:t>
-      </w:r>
-      <w:r>
-        <w:rPr>
-          <w:sz w:val="24"/>
-          <w:szCs w:val="24"/>
-        </w:rPr>
-        <w:t>y para</w:t>
-      </w:r>
-      <w:r>
-        <w:rPr>
-          <w:sz w:val="24"/>
-          <w:szCs w:val="24"/>
-        </w:rPr>
-        <w:t xml:space="preserve"> cada nodo se recorren sus vecinos utilizando la lista de ad</w:t>
-      </w:r>
-      <w:r>
-        <w:rPr>
-          <w:sz w:val="24"/>
-          <w:szCs w:val="24"/>
-        </w:rPr>
-        <w:t xml:space="preserve">yacencia del </w:t>
-      </w:r>
-      <w:proofErr w:type="spellStart"/>
-      <w:r>
-        <w:rPr>
-          <w:sz w:val="24"/>
-          <w:szCs w:val="24"/>
-        </w:rPr>
-        <w:t>map</w:t>
-      </w:r>
-      <w:proofErr w:type="spellEnd"/>
-      <w:r>
-        <w:rPr>
-          <w:sz w:val="24"/>
-          <w:szCs w:val="24"/>
-        </w:rPr>
-        <w:t>.</w:t>
-      </w:r>
-    </w:p>
-    <w:p>
-      <w:pPr>
-        <w:pStyle w:val="Textoindependiente"/>
-        <w:rPr>
-          <w:sz w:val="24"/>
-          <w:szCs w:val="24"/>
-        </w:rPr>
-      </w:pPr>
-      <w:r>
-        <w:rPr>
-          <w:sz w:val="24"/>
-          <w:szCs w:val="24"/>
-        </w:rPr>
-        <w:t>Si n es el número de nodos y A</w:t>
-      </w:r>
-      <w:r>
-        <w:rPr>
-          <w:sz w:val="24"/>
-          <w:szCs w:val="24"/>
-        </w:rPr>
-        <w:t xml:space="preserve"> el número de aristas</w:t>
-      </w:r>
-      <w:r>
-        <w:rPr>
-          <w:sz w:val="24"/>
-          <w:szCs w:val="24"/>
-        </w:rPr>
-        <w:t>, recorrer todos los nodos</w:t>
-      </w:r>
-      <w:r>
-        <w:rPr>
-          <w:sz w:val="24"/>
-          <w:szCs w:val="24"/>
-        </w:rPr>
-        <w:t xml:space="preserve"> tiene co</w:t>
-      </w:r>
-      <w:r>
-        <w:rPr>
-          <w:sz w:val="24"/>
-          <w:szCs w:val="24"/>
-        </w:rPr>
-        <w:t xml:space="preserve">ste </w:t>
-      </w:r>
-      <w:r>
-        <w:rPr>
-          <w:sz w:val="24"/>
-          <w:szCs w:val="24"/>
-        </w:rPr>
-        <w:t xml:space="preserve">O(n), mientras que </w:t>
-      </w:r>
-      <w:r>
-        <w:rPr>
-          <w:sz w:val="24"/>
-          <w:szCs w:val="24"/>
-        </w:rPr>
-        <w:t>recorrer</w:t>
-      </w:r>
-      <w:r>
-        <w:rPr>
-          <w:sz w:val="24"/>
-          <w:szCs w:val="24"/>
-        </w:rPr>
-        <w:t xml:space="preserve"> los vecinos de cada nodo equivale a </w:t>
-      </w:r>
-      <w:r>
-        <w:rPr>
-          <w:sz w:val="24"/>
-          <w:szCs w:val="24"/>
-        </w:rPr>
-        <w:t xml:space="preserve">recorrer las aristas del </w:t>
-      </w:r>
-      <w:r>
-        <w:rPr>
-          <w:sz w:val="24"/>
-          <w:szCs w:val="24"/>
-        </w:rPr>
-        <w:t>nodo</w:t>
-      </w:r>
-      <w:r>
-        <w:rPr>
-          <w:sz w:val="24"/>
-          <w:szCs w:val="24"/>
-        </w:rPr>
-        <w:t xml:space="preserve"> (de cada arista sale un nodo</w:t>
-      </w:r>
-      <w:r>
-        <w:rPr>
-          <w:sz w:val="24"/>
-          <w:szCs w:val="24"/>
-        </w:rPr>
-        <w:t xml:space="preserve"> vecino), p</w:t>
-      </w:r>
-      <w:r>
-        <w:rPr>
-          <w:sz w:val="24"/>
-          <w:szCs w:val="24"/>
-        </w:rPr>
-        <w:t>or tanto, la comp</w:t>
-      </w:r>
-      <w:r>
-        <w:rPr>
-          <w:sz w:val="24"/>
-          <w:szCs w:val="24"/>
-        </w:rPr>
-        <w:t>lejidad total del algoritmo es O(</w:t>
-      </w:r>
-      <w:proofErr w:type="spellStart"/>
-      <w:r>
-        <w:rPr>
-          <w:sz w:val="24"/>
-          <w:szCs w:val="24"/>
-        </w:rPr>
-        <w:t>n+A</w:t>
-      </w:r>
-      <w:proofErr w:type="spellEnd"/>
-      <w:r>
-        <w:rPr>
-          <w:sz w:val="24"/>
-          <w:szCs w:val="24"/>
-        </w:rPr>
-        <w:t>)</w:t>
-      </w:r>
-    </w:p>
-    <w:p>
-      <w:pPr>
-        <w:pStyle w:val="Textoindependiente"/>
-        <w:rPr>
-          <w:sz w:val="24"/>
-          <w:szCs w:val="24"/>
-        </w:rPr>
-      </w:pPr>
-      <w:r>
-        <w:rPr>
-          <w:sz w:val="24"/>
-          <w:szCs w:val="24"/>
-        </w:rPr>
-        <w:t>En grafos dispersos, es decir, con pocas aristas (donde A</w:t>
-      </w:r>
-      <w:r>
-        <w:rPr>
-          <w:sz w:val="24"/>
-          <w:szCs w:val="24"/>
-        </w:rPr>
-        <w:t xml:space="preserve"> </w:t>
-      </w:r>
-      <w:r>
-        <w:rPr>
           <w:sz w:val="24"/>
           <w:szCs w:val="24"/>
         </w:rPr>
@@ -20785,25 +20123,7 @@
           <w:sz w:val="24"/>
           <w:szCs w:val="24"/>
         </w:rPr>
-        <w:t xml:space="preserve">Implementar una clase DevoradorTiempos.java, que emplee los grafos contenidos en </w:t>
-      </w:r>
-      <w:proofErr w:type="spellStart"/>
-      <w:r>
-        <w:rPr>
-          <w:b/>
-          <w:sz w:val="24"/>
-          <w:szCs w:val="24"/>
-        </w:rPr>
-        <w:t>sols</w:t>
-      </w:r>
-      <w:proofErr w:type="spellEnd"/>
-      <w:r>
-        <w:rPr>
-          <w:b/>
-          <w:sz w:val="24"/>
-          <w:szCs w:val="24"/>
-        </w:rPr>
-        <w:t xml:space="preserve"> y calculando el tiempo que tarda el algoritmo hecho en el apartado anterior en resolver el problema, de forma que se pueda ir rellenando la siguiente tabla.</w:t>
+        <w:t>Implementar una clase DevoradorTiempos.java, que emplee los grafos contenidos en sols y calculando el tiempo que tarda el algoritmo hecho en el apartado anterior en resolver el problema, de forma que se pueda ir rellenando la siguiente tabla.</w:t>
       </w:r>
     </w:p>
     <w:p>
@@ -21676,7 +20996,23 @@
           <w:sz w:val="24"/>
           <w:szCs w:val="24"/>
         </w:rPr>
-        <w:t xml:space="preserve"> (si la duplicamos vemos que el tiempo se multiplica por 2)</w:t>
+        <w:t xml:space="preserve"> (si la duplicamos vemos que el tiempo se multiplica por </w:t>
+      </w:r>
+      <w:r>
+        <w:rPr>
+          <w:sz w:val="24"/>
+          <w:szCs w:val="24"/>
+        </w:rPr>
+        <w:t xml:space="preserve">un poco más de </w:t>
+      </w:r>
+      <w:bookmarkStart w:id="0" w:name="_GoBack"/>
+      <w:bookmarkEnd w:id="0"/>
+      <w:r>
+        <w:rPr>
+          <w:sz w:val="24"/>
+          <w:szCs w:val="24"/>
+        </w:rPr>
+        <w:t>2)</w:t>
       </w:r>
       <w:r>
         <w:rPr>
@@ -27228,23 +26564,7 @@
           <w:sz w:val="24"/>
           <w:szCs w:val="24"/>
         </w:rPr>
-        <w:t xml:space="preserve">), y como la complejidad del back tracking es el grado elevado a la altura, la complejidad del algoritmo es </w:t>
-      </w:r>
-      <w:proofErr w:type="gramStart"/>
-      <w:r>
-        <w:rPr>
-          <w:sz w:val="24"/>
-          <w:szCs w:val="24"/>
-        </w:rPr>
-        <w:t>O(</w:t>
-      </w:r>
-      <w:proofErr w:type="gramEnd"/>
-      <w:r>
-        <w:rPr>
-          <w:sz w:val="24"/>
-          <w:szCs w:val="24"/>
-        </w:rPr>
-        <w:t>n</w:t>
+        <w:t>), y como la complejidad del back tracking es el grado elevado a la altura, la complejidad del algoritmo es O(n</w:t>
       </w:r>
       <w:r>
         <w:rPr>
@@ -28541,25 +27861,7 @@
           <w:sz w:val="24"/>
           <w:szCs w:val="24"/>
         </w:rPr>
-        <w:t xml:space="preserve">Resultado de ejecutar </w:t>
-      </w:r>
-      <w:proofErr w:type="spellStart"/>
-      <w:r>
-        <w:rPr>
-          <w:b/>
-          <w:sz w:val="24"/>
-          <w:szCs w:val="24"/>
-        </w:rPr>
-        <w:t>AlmacenajeContenedoresRyP</w:t>
-      </w:r>
-      <w:proofErr w:type="spellEnd"/>
-      <w:r>
-        <w:rPr>
-          <w:b/>
-          <w:sz w:val="24"/>
-          <w:szCs w:val="24"/>
-        </w:rPr>
-        <w:t xml:space="preserve"> con el test09.txt</w:t>
+        <w:t>Resultado de ejecutar AlmacenajeContenedoresRyP con el test09.txt</w:t>
       </w:r>
     </w:p>
     <w:p>
@@ -29226,8 +28528,6 @@
         </w:rPr>
         <w:t>P6-Opcional</w:t>
       </w:r>
-      <w:bookmarkStart w:id="0" w:name="_GoBack"/>
-      <w:bookmarkEnd w:id="0"/>
     </w:p>
     <w:p>
       <w:pPr>
@@ -30174,7 +29474,7 @@
 </file>
 
 <file path=customXml/itemProps1.xml><?xml version="1.0" encoding="utf-8"?>
-<ds:datastoreItem xmlns:ds="http://schemas.openxmlformats.org/officeDocument/2006/customXml" ds:itemID="{FBDCB6D4-F6AF-4853-A068-F04D1688702B}">
+<ds:datastoreItem xmlns:ds="http://schemas.openxmlformats.org/officeDocument/2006/customXml" ds:itemID="{69A86A01-B5E6-42DC-B054-9CFCB35BAFB1}">
   <ds:schemaRefs>
     <ds:schemaRef ds:uri="http://schemas.openxmlformats.org/officeDocument/2006/bibliography"/>
   </ds:schemaRefs>

</xml_diff>